<commit_message>
Update CV content, certifications, contact details, and role alignment
</commit_message>
<xml_diff>
--- a/MGarcia_CV_Redesigned_2026.docx
+++ b/MGarcia_CV_Redesigned_2026.docx
@@ -4,6 +4,8 @@
   <w:body>
     <w:p>
       <w:pPr>
+        <w:keepLines w:val="1"/>
+        <w:widowControl w:val="1"/>
         <w:spacing w:before="0" w:after="40"/>
       </w:pPr>
       <w:r>
@@ -17,6 +19,8 @@
     </w:p>
     <w:p>
       <w:pPr>
+        <w:keepLines w:val="1"/>
+        <w:widowControl w:val="1"/>
         <w:spacing w:before="0" w:after="80"/>
       </w:pPr>
       <w:r>
@@ -25,11 +29,13 @@
           <w:sz w:val="22"/>
           <w:color w:val="1E40AF"/>
         </w:rPr>
-        <w:t>Lead Platform Engineer | Senior DevOps &amp; SRE Specialist | Cloud Solutions Architect</w:t>
-      </w:r>
-    </w:p>
-    <w:p>
-      <w:pPr>
+        <w:t>Senior Platform Engineer | Senior DevOps &amp; SRE Specialist | Cloud Solutions Architect</w:t>
+      </w:r>
+    </w:p>
+    <w:p>
+      <w:pPr>
+        <w:keepLines w:val="1"/>
+        <w:widowControl w:val="1"/>
         <w:pBdr>
           <w:bottom w:val="single" w:sz="8" w:space="8" w:color="0F294A"/>
         </w:pBdr>
@@ -40,11 +46,14 @@
           <w:sz w:val="18"/>
           <w:color w:val="475569"/>
         </w:rPr>
-        <w:t>Stockholm, Sweden  •  +46 7 323 90562  •  marcelo.garcia@linux.com  •  linkedin.com/in/marcelodevops  •  github.com/marcelodevops</w:t>
-      </w:r>
-    </w:p>
-    <w:p>
-      <w:pPr>
+        <w:t>Santiago, Chile  •  +56 9 3194 2642  •  marcelo.garcia@linux.com  •  linkedin.com/in/marcelodevops  •  github.com/marcelodevops</w:t>
+      </w:r>
+    </w:p>
+    <w:p>
+      <w:pPr>
+        <w:keepNext w:val="1"/>
+        <w:keepLines w:val="1"/>
+        <w:widowControl w:val="1"/>
         <w:pBdr>
           <w:bottom w:val="single" w:sz="6" w:space="4" w:color="CBD5E1"/>
         </w:pBdr>
@@ -61,6 +70,8 @@
     </w:p>
     <w:p>
       <w:pPr>
+        <w:keepLines w:val="1"/>
+        <w:widowControl w:val="1"/>
         <w:spacing w:before="0" w:after="60"/>
       </w:pPr>
       <w:r>
@@ -68,11 +79,14 @@
           <w:sz w:val="20"/>
           <w:color w:val="334155"/>
         </w:rPr>
-        <w:t>Senior Platform Engineer and DevOps/SRE Leader with 21+ years of overall IT experience and 10+ years architecting, securing, and scaling cloud-native infrastructure across AWS, Google Cloud, and Azure. Deep technical authority in Kubernetes orchestration (EKS/GKE), GitOps automation (ArgoCD), service mesh (Istio), automated IaC (Terraform, Pulumi), and enterprise observability (Prometheus, Grafana, Loki, Datadog). Proven track record of slashing cloud operational costs by up to 40% and accelerating delivery velocity from hours to minutes, combined with pioneering work in agentic engineering, local LLM tooling, and autonomous workflow runtimes.</w:t>
-      </w:r>
-    </w:p>
-    <w:p>
-      <w:pPr>
+        <w:t>Senior Platform Engineer and DevOps/SRE Leader with 21+ years of overall IT experience and 10+ years architecting, securing, and scaling cloud-native infrastructure across AWS, Google Cloud, and Azure. Deep technical authority in Kubernetes orchestration (EKS/GKE/AKS), GitOps automation (ArgoCD), service mesh (Istio), automated IaC (Terraform, Pulumi), and enterprise observability (Prometheus, Grafana, Loki, Datadog). Proven track record of slashing cloud operational costs by up to 40% and accelerating delivery velocity from hours to minutes, combined with pioneering work in agentic engineering, local LLM tooling, and autonomous workflow runtimes.</w:t>
+      </w:r>
+    </w:p>
+    <w:p>
+      <w:pPr>
+        <w:keepNext w:val="1"/>
+        <w:keepLines w:val="1"/>
+        <w:widowControl w:val="1"/>
         <w:pBdr>
           <w:bottom w:val="single" w:sz="6" w:space="4" w:color="CBD5E1"/>
         </w:pBdr>
@@ -89,6 +103,8 @@
     </w:p>
     <w:p>
       <w:pPr>
+        <w:keepLines w:val="1"/>
+        <w:widowControl w:val="1"/>
         <w:ind w:left="240" w:hanging="240"/>
         <w:spacing w:before="20" w:after="40"/>
       </w:pPr>
@@ -105,11 +121,13 @@
           <w:sz w:val="19"/>
           <w:color w:val="334155"/>
         </w:rPr>
-        <w:t>AWS (EKS, ECS, Lambda, RDS, S3, Route53, EMR, Kinesis, Batch), Google Cloud Platform (GKE, BigQuery, Pub/Sub, Dataflow, Cloud Run), Azure (Functions, Monitor, DevOps), Google Distributed Cloud (Anthos), Serverless Stack (SST), AWS CDK</w:t>
-      </w:r>
-    </w:p>
-    <w:p>
-      <w:pPr>
+        <w:t>AWS (EKS, ECS, Lambda, RDS, S3, Route53, EMR, Kinesis, Batch), Google Cloud Platform (GKE, BigQuery, Pub/Sub, Dataflow, Cloud Run), Azure (AKS, Functions, Monitor, DevOps), Google Distributed Cloud (Anthos), Serverless Stack (SST), AWS CDK</w:t>
+      </w:r>
+    </w:p>
+    <w:p>
+      <w:pPr>
+        <w:keepLines w:val="1"/>
+        <w:widowControl w:val="1"/>
         <w:ind w:left="240" w:hanging="240"/>
         <w:spacing w:before="20" w:after="40"/>
       </w:pPr>
@@ -126,11 +144,13 @@
           <w:sz w:val="19"/>
           <w:color w:val="334155"/>
         </w:rPr>
-        <w:t>Kubernetes (EKS, GKE, KOPS, Architecture &amp; Admin), Docker, ArgoCD, Helm / Helmfile, Kustomize, Istio Service Mesh, Karpenter, Kyverno, OpenShift</w:t>
-      </w:r>
-    </w:p>
-    <w:p>
-      <w:pPr>
+        <w:t>Kubernetes (EKS, GKE, AKS, kOps, Architecture &amp; Admin), Docker, ArgoCD, Helm / Helmfile, Kustomize, Istio Service Mesh, Karpenter, Kyverno, OpenShift</w:t>
+      </w:r>
+    </w:p>
+    <w:p>
+      <w:pPr>
+        <w:keepLines w:val="1"/>
+        <w:widowControl w:val="1"/>
         <w:ind w:left="240" w:hanging="240"/>
         <w:spacing w:before="20" w:after="40"/>
       </w:pPr>
@@ -152,6 +172,8 @@
     </w:p>
     <w:p>
       <w:pPr>
+        <w:keepLines w:val="1"/>
+        <w:widowControl w:val="1"/>
         <w:ind w:left="240" w:hanging="240"/>
         <w:spacing w:before="20" w:after="40"/>
       </w:pPr>
@@ -173,6 +195,8 @@
     </w:p>
     <w:p>
       <w:pPr>
+        <w:keepLines w:val="1"/>
+        <w:widowControl w:val="1"/>
         <w:ind w:left="240" w:hanging="240"/>
         <w:spacing w:before="20" w:after="40"/>
       </w:pPr>
@@ -194,6 +218,8 @@
     </w:p>
     <w:p>
       <w:pPr>
+        <w:keepLines w:val="1"/>
+        <w:widowControl w:val="1"/>
         <w:ind w:left="240" w:hanging="240"/>
         <w:spacing w:before="20" w:after="40"/>
       </w:pPr>
@@ -203,18 +229,20 @@
           <w:sz w:val="19"/>
           <w:color w:val="0F294A"/>
         </w:rPr>
-        <w:t xml:space="preserve">• Languages &amp; Data Platforms: </w:t>
-      </w:r>
-      <w:r>
-        <w:rPr>
-          <w:sz w:val="19"/>
-          <w:color w:val="334155"/>
-        </w:rPr>
-        <w:t>Python (FastAPI, Scripting), Go (Golang), TypeScript / Node.js, Bash Scripting, Apache Kafka, Apache Spark, PostgreSQL, MongoDB, ClickHouse, Redis / Valkey</w:t>
-      </w:r>
-    </w:p>
-    <w:p>
-      <w:pPr>
+        <w:t xml:space="preserve">• Languages, Data &amp; BI Platforms: </w:t>
+      </w:r>
+      <w:r>
+        <w:rPr>
+          <w:sz w:val="19"/>
+          <w:color w:val="334155"/>
+        </w:rPr>
+        <w:t>Python (FastAPI, Scripting), Go (Golang), TypeScript / Node.js, Bash Scripting, Apache Kafka, Apache Spark, PostgreSQL, MongoDB, ClickHouse, Redis / Valkey, Microsoft Fabric, Power BI</w:t>
+      </w:r>
+    </w:p>
+    <w:p>
+      <w:pPr>
+        <w:keepLines w:val="1"/>
+        <w:widowControl w:val="1"/>
         <w:ind w:left="240" w:hanging="240"/>
         <w:spacing w:before="20" w:after="40"/>
       </w:pPr>
@@ -224,18 +252,21 @@
           <w:sz w:val="19"/>
           <w:color w:val="0F294A"/>
         </w:rPr>
-        <w:t xml:space="preserve">• AI &amp; Agentic Engineering: </w:t>
-      </w:r>
-      <w:r>
-        <w:rPr>
-          <w:sz w:val="19"/>
-          <w:color w:val="334155"/>
-        </w:rPr>
-        <w:t>LangChain, OpenAI API, Ollama, Qwen / DeepSeek Runtimes, Agent Observability &amp; Evaluation, LangSmith, Terminal Agent Tooling (Ghostty, Zed)</w:t>
-      </w:r>
-    </w:p>
-    <w:p>
-      <w:pPr>
+        <w:t xml:space="preserve">• AI, MLOps &amp; Agentic Engineering: </w:t>
+      </w:r>
+      <w:r>
+        <w:rPr>
+          <w:sz w:val="19"/>
+          <w:color w:val="334155"/>
+        </w:rPr>
+        <w:t>Kubeflow, Amazon SageMaker, Amazon Bedrock, Microsoft Copilot Studio, LangChain, Azure OpenAI / OpenAI API, Ollama, Qwen / DeepSeek Runtimes, Agent Observability &amp; Evaluation, LangSmith, Developer &amp; Terminal Tooling (Ghostty, Zed)</w:t>
+      </w:r>
+    </w:p>
+    <w:p>
+      <w:pPr>
+        <w:keepNext w:val="1"/>
+        <w:keepLines w:val="1"/>
+        <w:widowControl w:val="1"/>
         <w:pBdr>
           <w:bottom w:val="single" w:sz="6" w:space="4" w:color="CBD5E1"/>
         </w:pBdr>
@@ -252,6 +283,9 @@
     </w:p>
     <w:p>
       <w:pPr>
+        <w:keepNext w:val="1"/>
+        <w:keepLines w:val="1"/>
+        <w:widowControl w:val="1"/>
         <w:tabs>
           <w:tab w:val="right" w:pos="10106"/>
         </w:tabs>
@@ -263,7 +297,7 @@
           <w:sz w:val="21"/>
           <w:color w:val="0F294A"/>
         </w:rPr>
-        <w:t>Senior DevOps &amp; Platform Engineer (Agentic Engineering)</w:t>
+        <w:t>Senior DevOps &amp; Platform Engineer (Contract)</w:t>
       </w:r>
       <w:r>
         <w:rPr>
@@ -278,7 +312,7 @@
           <w:sz w:val="20"/>
           <w:color w:val="1E40AF"/>
         </w:rPr>
-        <w:t>Freight Forwarder Chile</w:t>
+        <w:t>Taina — Freight Forwarder Chile</w:t>
       </w:r>
       <w:r>
         <w:tab/>
@@ -289,18 +323,21 @@
           <w:sz w:val="19"/>
           <w:color w:val="334155"/>
         </w:rPr>
-        <w:t>03/2025 – Present</w:t>
+        <w:t>03/2025 – 05/2026</w:t>
       </w:r>
       <w:r>
         <w:rPr>
           <w:sz w:val="18"/>
           <w:color w:val="64748B"/>
         </w:rPr>
-        <w:t xml:space="preserve"> (Remote / Santiago)</w:t>
-      </w:r>
-    </w:p>
-    <w:p>
-      <w:pPr>
+        <w:t xml:space="preserve"> (Remote / Santiago, Chile)</w:t>
+      </w:r>
+    </w:p>
+    <w:p>
+      <w:pPr>
+        <w:keepNext w:val="1"/>
+        <w:keepLines w:val="1"/>
+        <w:widowControl w:val="1"/>
         <w:ind w:left="360" w:hanging="240"/>
         <w:spacing w:before="0" w:after="40"/>
       </w:pPr>
@@ -324,11 +361,14 @@
           <w:sz w:val="19"/>
           <w:color w:val="334155"/>
         </w:rPr>
-        <w:t>Architected and provisioned an enterprise EKS platform utilizing Terraform, EKS Pod Identity, Karpenter Spot autoscaling, and ArgoCD with automated synchronization, self-healing, and drift detection.</w:t>
-      </w:r>
-    </w:p>
-    <w:p>
-      <w:pPr>
+        <w:t>Designed a Terraform-based Amazon EKS platform using EKS Pod Identity, Karpenter Spot autoscaling, and ArgoCD with automated synchronization, self-healing, and pruning.</w:t>
+      </w:r>
+    </w:p>
+    <w:p>
+      <w:pPr>
+        <w:keepNext w:val="1"/>
+        <w:keepLines w:val="1"/>
+        <w:widowControl w:val="1"/>
         <w:ind w:left="360" w:hanging="240"/>
         <w:spacing w:before="0" w:after="40"/>
       </w:pPr>
@@ -352,11 +392,14 @@
           <w:sz w:val="19"/>
           <w:color w:val="334155"/>
         </w:rPr>
-        <w:t>Led Istio production-readiness and capacity assessments for onboarding ~96,000 transactions/minute onto shared ingress infrastructure; resolved scaling bottlenecks at 4/4 replicas and defined automated rollback guardrails for a 3x traffic expansion.</w:t>
-      </w:r>
-    </w:p>
-    <w:p>
-      <w:pPr>
+        <w:t>Led Istio production-readiness and capacity assessments for onboarding ~96,000 transactions/minute onto shared ingress infrastructure; identified exhausted autoscaling headroom at 4/4 replicas and defined load testing, monitoring, staged rollout, and rollback requirements for a projected 3x traffic increase.</w:t>
+      </w:r>
+    </w:p>
+    <w:p>
+      <w:pPr>
+        <w:keepNext w:val="1"/>
+        <w:keepLines w:val="1"/>
+        <w:widowControl w:val="1"/>
         <w:ind w:left="360" w:hanging="240"/>
         <w:spacing w:before="0" w:after="40"/>
       </w:pPr>
@@ -380,11 +423,14 @@
           <w:sz w:val="19"/>
           <w:color w:val="334155"/>
         </w:rPr>
-        <w:t>Resolved a critical 1.8 GiB memory over-reporting anomaly in Istio sidecars by cross-correlating Envoy, cAdvisor, and Prometheus telemetry, proving actual consumption at 199 MiB and correcting dashboard aggregation metrics.</w:t>
-      </w:r>
-    </w:p>
-    <w:p>
-      <w:pPr>
+        <w:t>Investigated reported Istio sidecar memory consumption using Envoy, cAdvisor, and Prometheus telemetry; measured approximately 199 MiB of utilization and identified dashboard aggregation as the likely source of a 1.8 GiB discrepancy.</w:t>
+      </w:r>
+    </w:p>
+    <w:p>
+      <w:pPr>
+        <w:keepNext w:val="1"/>
+        <w:keepLines w:val="1"/>
+        <w:widowControl w:val="1"/>
         <w:ind w:left="360" w:hanging="240"/>
         <w:spacing w:before="0" w:after="40"/>
       </w:pPr>
@@ -408,39 +454,44 @@
           <w:sz w:val="19"/>
           <w:color w:val="334155"/>
         </w:rPr>
-        <w:t>Hardened Kubernetes secrets architecture with CyberArk Conjur OSS and External Secrets Operator, addressing CA trust, SAN validation, JWT service-account identity, and JWKS audience verification.</w:t>
-      </w:r>
-    </w:p>
-    <w:p>
-      <w:pPr>
-        <w:ind w:left="360" w:hanging="240"/>
-        <w:spacing w:before="0" w:after="40"/>
-      </w:pPr>
-      <w:r>
-        <w:rPr>
-          <w:sz w:val="19"/>
-          <w:color w:val="1E40AF"/>
-        </w:rPr>
-        <w:t xml:space="preserve">▪  </w:t>
-      </w:r>
-      <w:r>
-        <w:rPr>
-          <w:b/>
-          <w:sz w:val="19"/>
-          <w:color w:val="0F294A"/>
-        </w:rPr>
-        <w:t xml:space="preserve">Agentic Logistics Automation: </w:t>
-      </w:r>
-      <w:r>
-        <w:rPr>
-          <w:sz w:val="19"/>
-          <w:color w:val="334155"/>
-        </w:rPr>
-        <w:t>Engineered microservices in Python (FastAPI) and an autonomous logistics agent system using LangChain and OpenAI API to automate multi-variable load assignments to vessels based on cargo dimensions, routes, and operational priority.</w:t>
-      </w:r>
-    </w:p>
-    <w:p>
-      <w:pPr>
+        <w:t>Hardened Kubernetes secrets architecture with CyberArk Conjur OSS and External Secrets Operator, addressing CA trust, SAN validation, JWT service-account identity, and OIDC issuer, audience, and JWKS configuration.</w:t>
+      </w:r>
+    </w:p>
+    <w:p>
+      <w:pPr>
+        <w:keepLines w:val="1"/>
+        <w:widowControl w:val="1"/>
+        <w:ind w:left="360" w:hanging="240"/>
+        <w:spacing w:before="0" w:after="40"/>
+      </w:pPr>
+      <w:r>
+        <w:rPr>
+          <w:sz w:val="19"/>
+          <w:color w:val="1E40AF"/>
+        </w:rPr>
+        <w:t xml:space="preserve">▪  </w:t>
+      </w:r>
+      <w:r>
+        <w:rPr>
+          <w:b/>
+          <w:sz w:val="19"/>
+          <w:color w:val="0F294A"/>
+        </w:rPr>
+        <w:t xml:space="preserve">Agentic Logistics &amp; Local LLM Tooling: </w:t>
+      </w:r>
+      <w:r>
+        <w:rPr>
+          <w:sz w:val="19"/>
+          <w:color w:val="334155"/>
+        </w:rPr>
+        <w:t>Built Python (FastAPI) microservices and an agentic logistics system using LangChain and Azure OpenAI to assign cargo to vessels based on dimensions, routes, and priorities, deployed on Azure Kubernetes Service (AKS); evaluated local LLM runtimes (Ollama, Qwen, DeepSeek) with LangSmith tracing.</w:t>
+      </w:r>
+    </w:p>
+    <w:p>
+      <w:pPr>
+        <w:keepNext w:val="1"/>
+        <w:keepLines w:val="1"/>
+        <w:widowControl w:val="1"/>
         <w:tabs>
           <w:tab w:val="right" w:pos="10106"/>
         </w:tabs>
@@ -490,6 +541,9 @@
     </w:p>
     <w:p>
       <w:pPr>
+        <w:keepNext w:val="1"/>
+        <w:keepLines w:val="1"/>
+        <w:widowControl w:val="1"/>
         <w:ind w:left="360" w:hanging="240"/>
         <w:spacing w:before="0" w:after="40"/>
       </w:pPr>
@@ -518,6 +572,9 @@
     </w:p>
     <w:p>
       <w:pPr>
+        <w:keepNext w:val="1"/>
+        <w:keepLines w:val="1"/>
+        <w:widowControl w:val="1"/>
         <w:ind w:left="360" w:hanging="240"/>
         <w:spacing w:before="0" w:after="40"/>
       </w:pPr>
@@ -546,6 +603,9 @@
     </w:p>
     <w:p>
       <w:pPr>
+        <w:keepNext w:val="1"/>
+        <w:keepLines w:val="1"/>
+        <w:widowControl w:val="1"/>
         <w:ind w:left="360" w:hanging="240"/>
         <w:spacing w:before="0" w:after="40"/>
       </w:pPr>
@@ -574,6 +634,8 @@
     </w:p>
     <w:p>
       <w:pPr>
+        <w:keepLines w:val="1"/>
+        <w:widowControl w:val="1"/>
         <w:ind w:left="360" w:hanging="240"/>
         <w:spacing w:before="0" w:after="40"/>
       </w:pPr>
@@ -602,6 +664,9 @@
     </w:p>
     <w:p>
       <w:pPr>
+        <w:keepNext w:val="1"/>
+        <w:keepLines w:val="1"/>
+        <w:widowControl w:val="1"/>
         <w:tabs>
           <w:tab w:val="right" w:pos="10106"/>
         </w:tabs>
@@ -651,6 +716,9 @@
     </w:p>
     <w:p>
       <w:pPr>
+        <w:keepNext w:val="1"/>
+        <w:keepLines w:val="1"/>
+        <w:widowControl w:val="1"/>
         <w:ind w:left="360" w:hanging="240"/>
         <w:spacing w:before="0" w:after="40"/>
       </w:pPr>
@@ -674,11 +742,14 @@
           <w:sz w:val="19"/>
           <w:color w:val="334155"/>
         </w:rPr>
-        <w:t>Executed an accelerated 3-month zero-downtime migration from on-premises Docker Swarm to AWS, migrating 50+ Java microservices to Amazon EKS and 15+ distributed stateful platforms (Kafka, ZooKeeper, RabbitMQ, MongoDB, MSSQL) to EC2 and RDS.</w:t>
-      </w:r>
-    </w:p>
-    <w:p>
-      <w:pPr>
+        <w:t>Delivered a cloud migration against a tight 3-month deadline from on-premises Docker Swarm to AWS, migrating approximately 50 Java microservices to Amazon EKS and approximately 15 distributed stateful platforms (Kafka, ZooKeeper, RabbitMQ, MongoDB, MSSQL) to EC2 and RDS.</w:t>
+      </w:r>
+    </w:p>
+    <w:p>
+      <w:pPr>
+        <w:keepNext w:val="1"/>
+        <w:keepLines w:val="1"/>
+        <w:widowControl w:val="1"/>
         <w:ind w:left="360" w:hanging="240"/>
         <w:spacing w:before="0" w:after="40"/>
       </w:pPr>
@@ -707,6 +778,9 @@
     </w:p>
     <w:p>
       <w:pPr>
+        <w:keepNext w:val="1"/>
+        <w:keepLines w:val="1"/>
+        <w:widowControl w:val="1"/>
         <w:ind w:left="360" w:hanging="240"/>
         <w:spacing w:before="0" w:after="40"/>
       </w:pPr>
@@ -735,34 +809,39 @@
     </w:p>
     <w:p>
       <w:pPr>
-        <w:ind w:left="360" w:hanging="240"/>
-        <w:spacing w:before="0" w:after="40"/>
-      </w:pPr>
-      <w:r>
-        <w:rPr>
-          <w:sz w:val="19"/>
-          <w:color w:val="1E40AF"/>
-        </w:rPr>
-        <w:t xml:space="preserve">▪  </w:t>
-      </w:r>
-      <w:r>
-        <w:rPr>
-          <w:b/>
-          <w:sz w:val="19"/>
-          <w:color w:val="0F294A"/>
-        </w:rPr>
-        <w:t xml:space="preserve">IaC &amp; Database Modernization: </w:t>
-      </w:r>
-      <w:r>
-        <w:rPr>
-          <w:sz w:val="19"/>
-          <w:color w:val="334155"/>
-        </w:rPr>
-        <w:t>Automated multi-account provisioning using Terraform and AWS CDK with Go; orchestrated robust database cutovers and backup/restore automations for MongoDB and MSSQL to RDS.</w:t>
-      </w:r>
-    </w:p>
-    <w:p>
-      <w:pPr>
+        <w:keepLines w:val="1"/>
+        <w:widowControl w:val="1"/>
+        <w:ind w:left="360" w:hanging="240"/>
+        <w:spacing w:before="0" w:after="40"/>
+      </w:pPr>
+      <w:r>
+        <w:rPr>
+          <w:sz w:val="19"/>
+          <w:color w:val="1E40AF"/>
+        </w:rPr>
+        <w:t xml:space="preserve">▪  </w:t>
+      </w:r>
+      <w:r>
+        <w:rPr>
+          <w:b/>
+          <w:sz w:val="19"/>
+          <w:color w:val="0F294A"/>
+        </w:rPr>
+        <w:t xml:space="preserve">IaC, Observability &amp; Database Modernization: </w:t>
+      </w:r>
+      <w:r>
+        <w:rPr>
+          <w:sz w:val="19"/>
+          <w:color w:val="334155"/>
+        </w:rPr>
+        <w:t>Automated infrastructure provisioning using Terraform and AWS CDK with Go; integrated Datadog and ELK Stack monitoring across migrated workloads, and orchestrated MongoDB and MSSQL cutovers to AWS RDS.</w:t>
+      </w:r>
+    </w:p>
+    <w:p>
+      <w:pPr>
+        <w:keepNext w:val="1"/>
+        <w:keepLines w:val="1"/>
+        <w:widowControl w:val="1"/>
         <w:tabs>
           <w:tab w:val="right" w:pos="10106"/>
         </w:tabs>
@@ -812,34 +891,40 @@
     </w:p>
     <w:p>
       <w:pPr>
-        <w:ind w:left="360" w:hanging="240"/>
-        <w:spacing w:before="0" w:after="40"/>
-      </w:pPr>
-      <w:r>
-        <w:rPr>
-          <w:sz w:val="19"/>
-          <w:color w:val="1E40AF"/>
-        </w:rPr>
-        <w:t xml:space="preserve">▪  </w:t>
-      </w:r>
-      <w:r>
-        <w:rPr>
-          <w:b/>
-          <w:sz w:val="19"/>
-          <w:color w:val="0F294A"/>
-        </w:rPr>
-        <w:t xml:space="preserve">Enterprise Data Mesh Architecture: </w:t>
-      </w:r>
-      <w:r>
-        <w:rPr>
-          <w:sz w:val="19"/>
-          <w:color w:val="334155"/>
-        </w:rPr>
-        <w:t>Built and validated a Google Cloud Proof of Concept (POC) transforming monolithic analytics into a decentralized Data Mesh model, migrating enterprise data assets from Azure Storage to Google BigQuery.</w:t>
-      </w:r>
-    </w:p>
-    <w:p>
-      <w:pPr>
+        <w:keepNext w:val="1"/>
+        <w:keepLines w:val="1"/>
+        <w:widowControl w:val="1"/>
+        <w:ind w:left="360" w:hanging="240"/>
+        <w:spacing w:before="0" w:after="40"/>
+      </w:pPr>
+      <w:r>
+        <w:rPr>
+          <w:sz w:val="19"/>
+          <w:color w:val="1E40AF"/>
+        </w:rPr>
+        <w:t xml:space="preserve">▪  </w:t>
+      </w:r>
+      <w:r>
+        <w:rPr>
+          <w:b/>
+          <w:sz w:val="19"/>
+          <w:color w:val="0F294A"/>
+        </w:rPr>
+        <w:t xml:space="preserve">Data Mesh Proof of Concept: </w:t>
+      </w:r>
+      <w:r>
+        <w:rPr>
+          <w:sz w:val="19"/>
+          <w:color w:val="334155"/>
+        </w:rPr>
+        <w:t>Worked on a Google Cloud Data Mesh proof of concept and served as a technical reference for the planned migration of data assets from Azure Storage to Google BigQuery.</w:t>
+      </w:r>
+    </w:p>
+    <w:p>
+      <w:pPr>
+        <w:keepNext w:val="1"/>
+        <w:keepLines w:val="1"/>
+        <w:widowControl w:val="1"/>
         <w:ind w:left="360" w:hanging="240"/>
         <w:spacing w:before="0" w:after="40"/>
       </w:pPr>
@@ -863,39 +948,44 @@
           <w:sz w:val="19"/>
           <w:color w:val="334155"/>
         </w:rPr>
-        <w:t>Architected Apache Kafka streaming pipelines utilizing custom Google Cloud Dataflow Flex Templates to stream real-time events into BigQuery and Pub/Sub.</w:t>
-      </w:r>
-    </w:p>
-    <w:p>
-      <w:pPr>
-        <w:ind w:left="360" w:hanging="240"/>
-        <w:spacing w:before="0" w:after="40"/>
-      </w:pPr>
-      <w:r>
-        <w:rPr>
-          <w:sz w:val="19"/>
-          <w:color w:val="1E40AF"/>
-        </w:rPr>
-        <w:t xml:space="preserve">▪  </w:t>
-      </w:r>
-      <w:r>
-        <w:rPr>
-          <w:b/>
-          <w:sz w:val="19"/>
-          <w:color w:val="0F294A"/>
-        </w:rPr>
-        <w:t xml:space="preserve">Centralized Secrets Management: </w:t>
-      </w:r>
-      <w:r>
-        <w:rPr>
-          <w:sz w:val="19"/>
-          <w:color w:val="334155"/>
-        </w:rPr>
-        <w:t>Designed and deployed HashiCorp Vault on Google Kubernetes Engine (GKE) via Terraform, delivering automated, identity-based secret distribution across heterogeneous cloud environments.</w:t>
-      </w:r>
-    </w:p>
-    <w:p>
-      <w:pPr>
+        <w:t>Implemented Apache Kafka streaming pipelines utilizing custom Google Cloud Dataflow Flex Templates to stream real-time events into BigQuery and Pub/Sub.</w:t>
+      </w:r>
+    </w:p>
+    <w:p>
+      <w:pPr>
+        <w:keepNext w:val="1"/>
+        <w:keepLines w:val="1"/>
+        <w:widowControl w:val="1"/>
+        <w:ind w:left="360" w:hanging="240"/>
+        <w:spacing w:before="0" w:after="40"/>
+      </w:pPr>
+      <w:r>
+        <w:rPr>
+          <w:sz w:val="19"/>
+          <w:color w:val="1E40AF"/>
+        </w:rPr>
+        <w:t xml:space="preserve">▪  </w:t>
+      </w:r>
+      <w:r>
+        <w:rPr>
+          <w:b/>
+          <w:sz w:val="19"/>
+          <w:color w:val="0F294A"/>
+        </w:rPr>
+        <w:t xml:space="preserve">Multi-Cloud Secrets Management PoC: </w:t>
+      </w:r>
+      <w:r>
+        <w:rPr>
+          <w:sz w:val="19"/>
+          <w:color w:val="334155"/>
+        </w:rPr>
+        <w:t>Developed two proofs of concept, one on Google Cloud Platform (GCP) and another on Azure Kubernetes Service (AKS), to test HashiCorp Vault secrets management across multi-cloud environments.</w:t>
+      </w:r>
+    </w:p>
+    <w:p>
+      <w:pPr>
+        <w:keepLines w:val="1"/>
+        <w:widowControl w:val="1"/>
         <w:ind w:left="360" w:hanging="240"/>
         <w:spacing w:before="0" w:after="40"/>
       </w:pPr>
@@ -919,11 +1009,14 @@
           <w:sz w:val="19"/>
           <w:color w:val="334155"/>
         </w:rPr>
-        <w:t>Built reusable GitHub Actions workflows across GCP, Azure, and AWS; integrated Grafana with Azure Monitor to provide unified SLI/SLO visibility and operational KPIs.</w:t>
-      </w:r>
-    </w:p>
-    <w:p>
-      <w:pPr>
+        <w:t>Built reusable GitHub Actions workflows across GCP, Azure, and AWS; added Grafana dashboards and operational KPIs, and used Azure Monitor to improve application visibility.</w:t>
+      </w:r>
+    </w:p>
+    <w:p>
+      <w:pPr>
+        <w:keepNext w:val="1"/>
+        <w:keepLines w:val="1"/>
+        <w:widowControl w:val="1"/>
         <w:tabs>
           <w:tab w:val="right" w:pos="10106"/>
         </w:tabs>
@@ -973,6 +1066,9 @@
     </w:p>
     <w:p>
       <w:pPr>
+        <w:keepNext w:val="1"/>
+        <w:keepLines w:val="1"/>
+        <w:widowControl w:val="1"/>
         <w:ind w:left="360" w:hanging="240"/>
         <w:spacing w:before="0" w:after="40"/>
       </w:pPr>
@@ -996,11 +1092,14 @@
           <w:sz w:val="19"/>
           <w:color w:val="334155"/>
         </w:rPr>
-        <w:t>Led the DevOps and SRE chapter, establishing technical competency matrices, career progression frameworks, and a blameless post-mortem culture fostering innovation and continuous learning.</w:t>
-      </w:r>
-    </w:p>
-    <w:p>
-      <w:pPr>
+        <w:t>Led the DevOps and SRE chapter, establishing technical competency matrices, learning plans, and a blameless team culture supporting experimentation and continuous learning.</w:t>
+      </w:r>
+    </w:p>
+    <w:p>
+      <w:pPr>
+        <w:keepNext w:val="1"/>
+        <w:keepLines w:val="1"/>
+        <w:widowControl w:val="1"/>
         <w:ind w:left="360" w:hanging="240"/>
         <w:spacing w:before="0" w:after="40"/>
       </w:pPr>
@@ -1029,6 +1128,8 @@
     </w:p>
     <w:p>
       <w:pPr>
+        <w:keepLines w:val="1"/>
+        <w:widowControl w:val="1"/>
         <w:ind w:left="360" w:hanging="240"/>
         <w:spacing w:before="0" w:after="40"/>
       </w:pPr>
@@ -1057,6 +1158,9 @@
     </w:p>
     <w:p>
       <w:pPr>
+        <w:keepNext w:val="1"/>
+        <w:keepLines w:val="1"/>
+        <w:widowControl w:val="1"/>
         <w:tabs>
           <w:tab w:val="right" w:pos="10106"/>
         </w:tabs>
@@ -1101,11 +1205,14 @@
           <w:sz w:val="18"/>
           <w:color w:val="64748B"/>
         </w:rPr>
-        <w:t xml:space="preserve"> (Remote (UK, Australia, USA))</w:t>
-      </w:r>
-    </w:p>
-    <w:p>
-      <w:pPr>
+        <w:t xml:space="preserve"> (Remote — UK, Australia, USA)</w:t>
+      </w:r>
+    </w:p>
+    <w:p>
+      <w:pPr>
+        <w:keepNext w:val="1"/>
+        <w:keepLines w:val="1"/>
+        <w:widowControl w:val="1"/>
         <w:ind w:left="360" w:hanging="240"/>
         <w:spacing w:before="0" w:after="40"/>
       </w:pPr>
@@ -1134,6 +1241,9 @@
     </w:p>
     <w:p>
       <w:pPr>
+        <w:keepNext w:val="1"/>
+        <w:keepLines w:val="1"/>
+        <w:widowControl w:val="1"/>
         <w:ind w:left="360" w:hanging="240"/>
         <w:spacing w:before="0" w:after="40"/>
       </w:pPr>
@@ -1157,11 +1267,13 @@
           <w:sz w:val="19"/>
           <w:color w:val="334155"/>
         </w:rPr>
-        <w:t>Configured and managed Kubernetes clusters on GCP with Istio service mesh and the Apigee Istio Adapter (v1.4.1), enforcing strict mTLS encryption and traffic policies.</w:t>
-      </w:r>
-    </w:p>
-    <w:p>
-      <w:pPr>
+        <w:t>Configured and managed Kubernetes clusters on GCP with Istio service mesh and the Apigee Istio Adapter (v1.4.1).</w:t>
+      </w:r>
+    </w:p>
+    <w:p>
+      <w:pPr>
+        <w:keepLines w:val="1"/>
+        <w:widowControl w:val="1"/>
         <w:ind w:left="360" w:hanging="240"/>
         <w:spacing w:before="0" w:after="40"/>
       </w:pPr>
@@ -1185,11 +1297,14 @@
           <w:sz w:val="19"/>
           <w:color w:val="334155"/>
         </w:rPr>
-        <w:t>Engineered and managed resilient, highly available Kubernetes clusters in AWS Canada Central using KOPS with least-privilege IAM security controls prior to regional EKS availability.</w:t>
-      </w:r>
-    </w:p>
-    <w:p>
-      <w:pPr>
+        <w:t>Engineered and managed resilient, highly available Kubernetes clusters in AWS Canada Central using kOps with least-privilege IAM security controls prior to regional EKS availability.</w:t>
+      </w:r>
+    </w:p>
+    <w:p>
+      <w:pPr>
+        <w:keepNext w:val="1"/>
+        <w:keepLines w:val="1"/>
+        <w:widowControl w:val="1"/>
         <w:tabs>
           <w:tab w:val="right" w:pos="10106"/>
         </w:tabs>
@@ -1239,34 +1354,40 @@
     </w:p>
     <w:p>
       <w:pPr>
-        <w:ind w:left="360" w:hanging="240"/>
-        <w:spacing w:before="0" w:after="40"/>
-      </w:pPr>
-      <w:r>
-        <w:rPr>
-          <w:sz w:val="19"/>
-          <w:color w:val="1E40AF"/>
-        </w:rPr>
-        <w:t xml:space="preserve">▪  </w:t>
-      </w:r>
-      <w:r>
-        <w:rPr>
-          <w:b/>
-          <w:sz w:val="19"/>
-          <w:color w:val="0F294A"/>
-        </w:rPr>
-        <w:t xml:space="preserve">Massive Cost Reduction: </w:t>
-      </w:r>
-      <w:r>
-        <w:rPr>
-          <w:sz w:val="19"/>
-          <w:color w:val="334155"/>
-        </w:rPr>
-        <w:t>Slashed AWS cloud infrastructure expenditure by 40% through infrastructure audits, Spot instance adoption, and automated idle resource termination.</w:t>
-      </w:r>
-    </w:p>
-    <w:p>
-      <w:pPr>
+        <w:keepNext w:val="1"/>
+        <w:keepLines w:val="1"/>
+        <w:widowControl w:val="1"/>
+        <w:ind w:left="360" w:hanging="240"/>
+        <w:spacing w:before="0" w:after="40"/>
+      </w:pPr>
+      <w:r>
+        <w:rPr>
+          <w:sz w:val="19"/>
+          <w:color w:val="1E40AF"/>
+        </w:rPr>
+        <w:t xml:space="preserve">▪  </w:t>
+      </w:r>
+      <w:r>
+        <w:rPr>
+          <w:b/>
+          <w:sz w:val="19"/>
+          <w:color w:val="0F294A"/>
+        </w:rPr>
+        <w:t xml:space="preserve">Cloud Cost Optimization: </w:t>
+      </w:r>
+      <w:r>
+        <w:rPr>
+          <w:sz w:val="19"/>
+          <w:color w:val="334155"/>
+        </w:rPr>
+        <w:t>Reduced AWS cloud infrastructure costs by 40% through infrastructure optimization and automation.</w:t>
+      </w:r>
+    </w:p>
+    <w:p>
+      <w:pPr>
+        <w:keepNext w:val="1"/>
+        <w:keepLines w:val="1"/>
+        <w:widowControl w:val="1"/>
         <w:ind w:left="360" w:hanging="240"/>
         <w:spacing w:before="0" w:after="40"/>
       </w:pPr>
@@ -1295,6 +1416,9 @@
     </w:p>
     <w:p>
       <w:pPr>
+        <w:keepNext w:val="1"/>
+        <w:keepLines w:val="1"/>
+        <w:widowControl w:val="1"/>
         <w:ind w:left="360" w:hanging="240"/>
         <w:spacing w:before="0" w:after="40"/>
       </w:pPr>
@@ -1323,6 +1447,9 @@
     </w:p>
     <w:p>
       <w:pPr>
+        <w:keepNext w:val="1"/>
+        <w:keepLines w:val="1"/>
+        <w:widowControl w:val="1"/>
         <w:ind w:left="360" w:hanging="240"/>
         <w:spacing w:before="0" w:after="40"/>
       </w:pPr>
@@ -1351,6 +1478,39 @@
     </w:p>
     <w:p>
       <w:pPr>
+        <w:keepLines w:val="1"/>
+        <w:widowControl w:val="1"/>
+        <w:ind w:left="360" w:hanging="240"/>
+        <w:spacing w:before="0" w:after="40"/>
+      </w:pPr>
+      <w:r>
+        <w:rPr>
+          <w:sz w:val="19"/>
+          <w:color w:val="1E40AF"/>
+        </w:rPr>
+        <w:t xml:space="preserve">▪  </w:t>
+      </w:r>
+      <w:r>
+        <w:rPr>
+          <w:b/>
+          <w:sz w:val="19"/>
+          <w:color w:val="0F294A"/>
+        </w:rPr>
+        <w:t xml:space="preserve">MLOps Workflows: </w:t>
+      </w:r>
+      <w:r>
+        <w:rPr>
+          <w:sz w:val="19"/>
+          <w:color w:val="334155"/>
+        </w:rPr>
+        <w:t>Worked on MLOps workflows using Amazon SageMaker and Kubeflow components.</w:t>
+      </w:r>
+    </w:p>
+    <w:p>
+      <w:pPr>
+        <w:keepNext w:val="1"/>
+        <w:keepLines w:val="1"/>
+        <w:widowControl w:val="1"/>
         <w:tabs>
           <w:tab w:val="right" w:pos="10106"/>
         </w:tabs>
@@ -1362,7 +1522,7 @@
           <w:sz w:val="21"/>
           <w:color w:val="0F294A"/>
         </w:rPr>
-        <w:t>Earlier DevOps &amp; Systems Engineering Roles</w:t>
+        <w:t>Senior DevOps Engineer &amp; Lead Consultant</w:t>
       </w:r>
       <w:r>
         <w:rPr>
@@ -1377,7 +1537,7 @@
           <w:sz w:val="20"/>
           <w:color w:val="1E40AF"/>
         </w:rPr>
-        <w:t>Deloitte Canada | Sonnet | WSIB</w:t>
+        <w:t>Deloitte Canada</w:t>
       </w:r>
       <w:r>
         <w:tab/>
@@ -1400,23 +1560,26 @@
     </w:p>
     <w:p>
       <w:pPr>
-        <w:ind w:left="360" w:hanging="240"/>
-        <w:spacing w:before="0" w:after="40"/>
-      </w:pPr>
-      <w:r>
-        <w:rPr>
-          <w:sz w:val="19"/>
-          <w:color w:val="1E40AF"/>
-        </w:rPr>
-        <w:t xml:space="preserve">▪  </w:t>
-      </w:r>
-      <w:r>
-        <w:rPr>
-          <w:b/>
-          <w:sz w:val="19"/>
-          <w:color w:val="0F294A"/>
-        </w:rPr>
-        <w:t xml:space="preserve">Senior DevOps Engineer Lead (Deloitte): </w:t>
+        <w:keepNext w:val="1"/>
+        <w:keepLines w:val="1"/>
+        <w:widowControl w:val="1"/>
+        <w:ind w:left="360" w:hanging="240"/>
+        <w:spacing w:before="0" w:after="40"/>
+      </w:pPr>
+      <w:r>
+        <w:rPr>
+          <w:sz w:val="19"/>
+          <w:color w:val="1E40AF"/>
+        </w:rPr>
+        <w:t xml:space="preserve">▪  </w:t>
+      </w:r>
+      <w:r>
+        <w:rPr>
+          <w:b/>
+          <w:sz w:val="19"/>
+          <w:color w:val="0F294A"/>
+        </w:rPr>
+        <w:t xml:space="preserve">Senior DevOps Engineer Lead — Deloitte (07/2017 – 01/2018): </w:t>
       </w:r>
       <w:r>
         <w:rPr>
@@ -1428,23 +1591,26 @@
     </w:p>
     <w:p>
       <w:pPr>
-        <w:ind w:left="360" w:hanging="240"/>
-        <w:spacing w:before="0" w:after="40"/>
-      </w:pPr>
-      <w:r>
-        <w:rPr>
-          <w:sz w:val="19"/>
-          <w:color w:val="1E40AF"/>
-        </w:rPr>
-        <w:t xml:space="preserve">▪  </w:t>
-      </w:r>
-      <w:r>
-        <w:rPr>
-          <w:b/>
-          <w:sz w:val="19"/>
-          <w:color w:val="0F294A"/>
-        </w:rPr>
-        <w:t xml:space="preserve">DevOps Lead (Sonnet Insurance): </w:t>
+        <w:keepNext w:val="1"/>
+        <w:keepLines w:val="1"/>
+        <w:widowControl w:val="1"/>
+        <w:ind w:left="360" w:hanging="240"/>
+        <w:spacing w:before="0" w:after="40"/>
+      </w:pPr>
+      <w:r>
+        <w:rPr>
+          <w:sz w:val="19"/>
+          <w:color w:val="1E40AF"/>
+        </w:rPr>
+        <w:t xml:space="preserve">▪  </w:t>
+      </w:r>
+      <w:r>
+        <w:rPr>
+          <w:b/>
+          <w:sz w:val="19"/>
+          <w:color w:val="0F294A"/>
+        </w:rPr>
+        <w:t xml:space="preserve">DevOps Lead — Client: Sonnet Insurance (08/2015 – 06/2017): </w:t>
       </w:r>
       <w:r>
         <w:rPr>
@@ -1456,23 +1622,25 @@
     </w:p>
     <w:p>
       <w:pPr>
-        <w:ind w:left="360" w:hanging="240"/>
-        <w:spacing w:before="0" w:after="40"/>
-      </w:pPr>
-      <w:r>
-        <w:rPr>
-          <w:sz w:val="19"/>
-          <w:color w:val="1E40AF"/>
-        </w:rPr>
-        <w:t xml:space="preserve">▪  </w:t>
-      </w:r>
-      <w:r>
-        <w:rPr>
-          <w:b/>
-          <w:sz w:val="19"/>
-          <w:color w:val="0F294A"/>
-        </w:rPr>
-        <w:t xml:space="preserve">DevOps Engineer (WSIB): </w:t>
+        <w:keepLines w:val="1"/>
+        <w:widowControl w:val="1"/>
+        <w:ind w:left="360" w:hanging="240"/>
+        <w:spacing w:before="0" w:after="40"/>
+      </w:pPr>
+      <w:r>
+        <w:rPr>
+          <w:sz w:val="19"/>
+          <w:color w:val="1E40AF"/>
+        </w:rPr>
+        <w:t xml:space="preserve">▪  </w:t>
+      </w:r>
+      <w:r>
+        <w:rPr>
+          <w:b/>
+          <w:sz w:val="19"/>
+          <w:color w:val="0F294A"/>
+        </w:rPr>
+        <w:t xml:space="preserve">DevOps Engineer — Client: WSIB (02/2015 – 08/2015): </w:t>
       </w:r>
       <w:r>
         <w:rPr>
@@ -1484,6 +1652,9 @@
     </w:p>
     <w:p>
       <w:pPr>
+        <w:keepNext w:val="1"/>
+        <w:keepLines w:val="1"/>
+        <w:widowControl w:val="1"/>
         <w:pBdr>
           <w:bottom w:val="single" w:sz="6" w:space="4" w:color="CBD5E1"/>
         </w:pBdr>
@@ -1500,6 +1671,8 @@
     </w:p>
     <w:p>
       <w:pPr>
+        <w:keepLines w:val="1"/>
+        <w:widowControl w:val="1"/>
         <w:tabs>
           <w:tab w:val="right" w:pos="10106"/>
         </w:tabs>
@@ -1519,14 +1692,14 @@
           <w:sz w:val="19"/>
           <w:color w:val="0F294A"/>
         </w:rPr>
-        <w:t>MIT Professional Education: Cloud &amp; DevOps — Continuous Transformation</w:t>
-      </w:r>
-      <w:r>
-        <w:rPr>
-          <w:sz w:val="19"/>
-          <w:color w:val="64748B"/>
-        </w:rPr>
-        <w:t xml:space="preserve"> — MIT</w:t>
+        <w:t>AWS Certified Solutions Architect – Associate</w:t>
+      </w:r>
+      <w:r>
+        <w:rPr>
+          <w:sz w:val="19"/>
+          <w:color w:val="64748B"/>
+        </w:rPr>
+        <w:t xml:space="preserve"> — Amazon Web Services</w:t>
       </w:r>
       <w:r>
         <w:tab/>
@@ -1536,11 +1709,13 @@
           <w:sz w:val="18"/>
           <w:color w:val="475569"/>
         </w:rPr>
-        <w:t>2020 – 2021</w:t>
-      </w:r>
-    </w:p>
-    <w:p>
-      <w:pPr>
+        <w:t>2023</w:t>
+      </w:r>
+    </w:p>
+    <w:p>
+      <w:pPr>
+        <w:keepLines w:val="1"/>
+        <w:widowControl w:val="1"/>
         <w:tabs>
           <w:tab w:val="right" w:pos="10106"/>
         </w:tabs>
@@ -1560,14 +1735,14 @@
           <w:sz w:val="19"/>
           <w:color w:val="0F294A"/>
         </w:rPr>
-        <w:t>AWS Certified Solutions Architect – Associate</w:t>
-      </w:r>
-      <w:r>
-        <w:rPr>
-          <w:sz w:val="19"/>
-          <w:color w:val="64748B"/>
-        </w:rPr>
-        <w:t xml:space="preserve"> — Amazon Web Services</w:t>
+        <w:t>MIT Professional Education: Cloud &amp; DevOps — Continuous Transformation</w:t>
+      </w:r>
+      <w:r>
+        <w:rPr>
+          <w:sz w:val="19"/>
+          <w:color w:val="64748B"/>
+        </w:rPr>
+        <w:t xml:space="preserve"> — MIT</w:t>
       </w:r>
       <w:r>
         <w:tab/>
@@ -1577,11 +1752,13 @@
           <w:sz w:val="18"/>
           <w:color w:val="475569"/>
         </w:rPr>
-        <w:t>2023</w:t>
-      </w:r>
-    </w:p>
-    <w:p>
-      <w:pPr>
+        <w:t>2020 – 2021</w:t>
+      </w:r>
+    </w:p>
+    <w:p>
+      <w:pPr>
+        <w:keepLines w:val="1"/>
+        <w:widowControl w:val="1"/>
         <w:tabs>
           <w:tab w:val="right" w:pos="10106"/>
         </w:tabs>
@@ -1601,14 +1778,14 @@
           <w:sz w:val="19"/>
           <w:color w:val="0F294A"/>
         </w:rPr>
-        <w:t>Google Cloud Certified Professional Cloud Architect</w:t>
-      </w:r>
-      <w:r>
-        <w:rPr>
-          <w:sz w:val="19"/>
-          <w:color w:val="64748B"/>
-        </w:rPr>
-        <w:t xml:space="preserve"> — Google Cloud</w:t>
+        <w:t>Google Cloud Specialization: Architecting Hybrid Cloud with Anthos</w:t>
+      </w:r>
+      <w:r>
+        <w:rPr>
+          <w:sz w:val="19"/>
+          <w:color w:val="64748B"/>
+        </w:rPr>
+        <w:t xml:space="preserve"> — Google Cloud / Coursera</w:t>
       </w:r>
       <w:r>
         <w:tab/>
@@ -1618,11 +1795,13 @@
           <w:sz w:val="18"/>
           <w:color w:val="475569"/>
         </w:rPr>
-        <w:t>2019</w:t>
-      </w:r>
-    </w:p>
-    <w:p>
-      <w:pPr>
+        <w:t>2020</w:t>
+      </w:r>
+    </w:p>
+    <w:p>
+      <w:pPr>
+        <w:keepLines w:val="1"/>
+        <w:widowControl w:val="1"/>
         <w:tabs>
           <w:tab w:val="right" w:pos="10106"/>
         </w:tabs>
@@ -1642,14 +1821,14 @@
           <w:sz w:val="19"/>
           <w:color w:val="0F294A"/>
         </w:rPr>
-        <w:t>Google Cloud Certified Associate Cloud Engineer</w:t>
-      </w:r>
-      <w:r>
-        <w:rPr>
-          <w:sz w:val="19"/>
-          <w:color w:val="64748B"/>
-        </w:rPr>
-        <w:t xml:space="preserve"> — Google Cloud</w:t>
+        <w:t>Google Cloud Specialization: Security in Google Cloud Platform</w:t>
+      </w:r>
+      <w:r>
+        <w:rPr>
+          <w:sz w:val="19"/>
+          <w:color w:val="64748B"/>
+        </w:rPr>
+        <w:t xml:space="preserve"> — Google Cloud / Coursera</w:t>
       </w:r>
       <w:r>
         <w:tab/>
@@ -1659,11 +1838,13 @@
           <w:sz w:val="18"/>
           <w:color w:val="475569"/>
         </w:rPr>
-        <w:t>2019</w:t>
-      </w:r>
-    </w:p>
-    <w:p>
-      <w:pPr>
+        <w:t>2020</w:t>
+      </w:r>
+    </w:p>
+    <w:p>
+      <w:pPr>
+        <w:keepLines w:val="1"/>
+        <w:widowControl w:val="1"/>
         <w:tabs>
           <w:tab w:val="right" w:pos="10106"/>
         </w:tabs>
@@ -1683,14 +1864,14 @@
           <w:sz w:val="19"/>
           <w:color w:val="0F294A"/>
         </w:rPr>
-        <w:t>Google Cloud Specialization: Architecting Hybrid Cloud with Anthos</w:t>
-      </w:r>
-      <w:r>
-        <w:rPr>
-          <w:sz w:val="19"/>
-          <w:color w:val="64748B"/>
-        </w:rPr>
-        <w:t xml:space="preserve"> — Google Cloud</w:t>
+        <w:t>Cloud Architecture with Google Cloud (Professional Certificate)</w:t>
+      </w:r>
+      <w:r>
+        <w:rPr>
+          <w:sz w:val="19"/>
+          <w:color w:val="64748B"/>
+        </w:rPr>
+        <w:t xml:space="preserve"> — Google Cloud / Coursera</w:t>
       </w:r>
       <w:r>
         <w:tab/>
@@ -1700,11 +1881,13 @@
           <w:sz w:val="18"/>
           <w:color w:val="475569"/>
         </w:rPr>
-        <w:t>2020</w:t>
-      </w:r>
-    </w:p>
-    <w:p>
-      <w:pPr>
+        <w:t>2019</w:t>
+      </w:r>
+    </w:p>
+    <w:p>
+      <w:pPr>
+        <w:keepLines w:val="1"/>
+        <w:widowControl w:val="1"/>
         <w:tabs>
           <w:tab w:val="right" w:pos="10106"/>
         </w:tabs>
@@ -1724,14 +1907,14 @@
           <w:sz w:val="19"/>
           <w:color w:val="0F294A"/>
         </w:rPr>
-        <w:t>Google Cloud Specialization: Security in Google Cloud Platform</w:t>
-      </w:r>
-      <w:r>
-        <w:rPr>
-          <w:sz w:val="19"/>
-          <w:color w:val="64748B"/>
-        </w:rPr>
-        <w:t xml:space="preserve"> — Google Cloud</w:t>
+        <w:t>Cloud Engineering with Google Cloud (Professional Certificate)</w:t>
+      </w:r>
+      <w:r>
+        <w:rPr>
+          <w:sz w:val="19"/>
+          <w:color w:val="64748B"/>
+        </w:rPr>
+        <w:t xml:space="preserve"> — Google Cloud / Coursera</w:t>
       </w:r>
       <w:r>
         <w:tab/>
@@ -1741,11 +1924,13 @@
           <w:sz w:val="18"/>
           <w:color w:val="475569"/>
         </w:rPr>
-        <w:t>2020</w:t>
-      </w:r>
-    </w:p>
-    <w:p>
-      <w:pPr>
+        <w:t>2019</w:t>
+      </w:r>
+    </w:p>
+    <w:p>
+      <w:pPr>
+        <w:keepLines w:val="1"/>
+        <w:widowControl w:val="1"/>
         <w:tabs>
           <w:tab w:val="right" w:pos="10106"/>
         </w:tabs>
@@ -1772,7 +1957,7 @@
           <w:sz w:val="19"/>
           <w:color w:val="64748B"/>
         </w:rPr>
-        <w:t xml:space="preserve"> — Google Cloud</w:t>
+        <w:t xml:space="preserve"> — Google Cloud / Coursera</w:t>
       </w:r>
       <w:r>
         <w:tab/>
@@ -1787,6 +1972,8 @@
     </w:p>
     <w:p>
       <w:pPr>
+        <w:keepLines w:val="1"/>
+        <w:widowControl w:val="1"/>
         <w:tabs>
           <w:tab w:val="right" w:pos="10106"/>
         </w:tabs>
@@ -1806,14 +1993,14 @@
           <w:sz w:val="19"/>
           <w:color w:val="0F294A"/>
         </w:rPr>
-        <w:t>Google Certified Kubernetes Architect Specialization</w:t>
-      </w:r>
-      <w:r>
-        <w:rPr>
-          <w:sz w:val="19"/>
-          <w:color w:val="64748B"/>
-        </w:rPr>
-        <w:t xml:space="preserve"> — Google Cloud</w:t>
+        <w:t>Kubernetes Architecture in Google Cloud Specialization</w:t>
+      </w:r>
+      <w:r>
+        <w:rPr>
+          <w:sz w:val="19"/>
+          <w:color w:val="64748B"/>
+        </w:rPr>
+        <w:t xml:space="preserve"> — Google Cloud / Coursera</w:t>
       </w:r>
       <w:r>
         <w:tab/>
@@ -1828,6 +2015,8 @@
     </w:p>
     <w:p>
       <w:pPr>
+        <w:keepLines w:val="1"/>
+        <w:widowControl w:val="1"/>
         <w:tabs>
           <w:tab w:val="right" w:pos="10106"/>
         </w:tabs>
@@ -1847,14 +2036,14 @@
           <w:sz w:val="19"/>
           <w:color w:val="0F294A"/>
         </w:rPr>
-        <w:t>Linux Networking Administration Certification</w:t>
-      </w:r>
-      <w:r>
-        <w:rPr>
-          <w:sz w:val="19"/>
-          <w:color w:val="64748B"/>
-        </w:rPr>
-        <w:t xml:space="preserve"> — Linux Centre</w:t>
+        <w:t>IBM SoftLayer Fundamentals Certification</w:t>
+      </w:r>
+      <w:r>
+        <w:rPr>
+          <w:sz w:val="19"/>
+          <w:color w:val="64748B"/>
+        </w:rPr>
+        <w:t xml:space="preserve"> — IBM</w:t>
       </w:r>
       <w:r>
         <w:tab/>
@@ -1864,11 +2053,13 @@
           <w:sz w:val="18"/>
           <w:color w:val="475569"/>
         </w:rPr>
-        <w:t>2013</w:t>
-      </w:r>
-    </w:p>
-    <w:p>
-      <w:pPr>
+        <w:t>2016</w:t>
+      </w:r>
+    </w:p>
+    <w:p>
+      <w:pPr>
+        <w:keepLines w:val="1"/>
+        <w:widowControl w:val="1"/>
         <w:tabs>
           <w:tab w:val="right" w:pos="10106"/>
         </w:tabs>
@@ -1910,6 +2101,51 @@
     </w:p>
     <w:p>
       <w:pPr>
+        <w:keepLines w:val="1"/>
+        <w:widowControl w:val="1"/>
+        <w:tabs>
+          <w:tab w:val="right" w:pos="10106"/>
+        </w:tabs>
+        <w:ind w:left="240" w:hanging="240"/>
+        <w:spacing w:before="20" w:after="30"/>
+      </w:pPr>
+      <w:r>
+        <w:rPr>
+          <w:sz w:val="19"/>
+          <w:color w:val="1E40AF"/>
+        </w:rPr>
+        <w:t xml:space="preserve">• </w:t>
+      </w:r>
+      <w:r>
+        <w:rPr>
+          <w:b/>
+          <w:sz w:val="19"/>
+          <w:color w:val="0F294A"/>
+        </w:rPr>
+        <w:t>Linux Networking Administration Certification</w:t>
+      </w:r>
+      <w:r>
+        <w:rPr>
+          <w:sz w:val="19"/>
+          <w:color w:val="64748B"/>
+        </w:rPr>
+        <w:t xml:space="preserve"> — Linux Centre</w:t>
+      </w:r>
+      <w:r>
+        <w:tab/>
+      </w:r>
+      <w:r>
+        <w:rPr>
+          <w:sz w:val="18"/>
+          <w:color w:val="475569"/>
+        </w:rPr>
+        <w:t>2013</w:t>
+      </w:r>
+    </w:p>
+    <w:p>
+      <w:pPr>
+        <w:keepLines w:val="1"/>
+        <w:widowControl w:val="1"/>
         <w:tabs>
           <w:tab w:val="right" w:pos="10106"/>
         </w:tabs>

</xml_diff>